<commit_message>
Revision round 1: rebuilt S5 (full-text verified, patient independence + source location), restructured S4 (separated indexing/corpus/topic fields), added S2 PMID-level record sets + year-assignment rule, added S3 coding rules
</commit_message>
<xml_diff>
--- a/data/Supplementary_Table_S5_prognostic_signature_comparison.docx
+++ b/data/Supplementary_Table_S5_prognostic_signature_comparison.docx
@@ -21,20 +21,22 @@
         <w:tblLook w:firstColumn="1" w:firstRow="1" w:lastColumn="0" w:lastRow="0" w:noHBand="0" w:noVBand="1" w:val="04A0"/>
       </w:tblPr>
       <w:tblGrid>
-        <w:gridCol w:w="960"/>
-        <w:gridCol w:w="960"/>
-        <w:gridCol w:w="960"/>
-        <w:gridCol w:w="960"/>
-        <w:gridCol w:w="960"/>
-        <w:gridCol w:w="960"/>
-        <w:gridCol w:w="960"/>
-        <w:gridCol w:w="960"/>
-        <w:gridCol w:w="960"/>
+        <w:gridCol w:w="785"/>
+        <w:gridCol w:w="785"/>
+        <w:gridCol w:w="785"/>
+        <w:gridCol w:w="785"/>
+        <w:gridCol w:w="785"/>
+        <w:gridCol w:w="785"/>
+        <w:gridCol w:w="785"/>
+        <w:gridCol w:w="785"/>
+        <w:gridCol w:w="785"/>
+        <w:gridCol w:w="785"/>
+        <w:gridCol w:w="785"/>
       </w:tblGrid>
       <w:tr>
         <w:tc>
           <w:tcPr>
-            <w:tcW w:type="dxa" w:w="960"/>
+            <w:tcW w:type="dxa" w:w="785"/>
           </w:tcPr>
           <w:p>
             <w:r>
@@ -48,7 +50,7 @@
         </w:tc>
         <w:tc>
           <w:tcPr>
-            <w:tcW w:type="dxa" w:w="960"/>
+            <w:tcW w:type="dxa" w:w="785"/>
           </w:tcPr>
           <w:p>
             <w:r>
@@ -62,7 +64,7 @@
         </w:tc>
         <w:tc>
           <w:tcPr>
-            <w:tcW w:type="dxa" w:w="960"/>
+            <w:tcW w:type="dxa" w:w="785"/>
           </w:tcPr>
           <w:p>
             <w:r>
@@ -70,13 +72,13 @@
                 <w:b/>
                 <w:sz w:val="17"/>
               </w:rPr>
-              <w:t>Development data</w:t>
+              <w:t>Development cohort</w:t>
             </w:r>
           </w:p>
         </w:tc>
         <w:tc>
           <w:tcPr>
-            <w:tcW w:type="dxa" w:w="960"/>
+            <w:tcW w:type="dxa" w:w="785"/>
           </w:tcPr>
           <w:p>
             <w:r>
@@ -84,13 +86,13 @@
                 <w:b/>
                 <w:sz w:val="17"/>
               </w:rPr>
-              <w:t>Validation design</w:t>
+              <w:t>Validation cohort / design</w:t>
             </w:r>
           </w:p>
         </w:tc>
         <w:tc>
           <w:tcPr>
-            <w:tcW w:type="dxa" w:w="960"/>
+            <w:tcW w:type="dxa" w:w="785"/>
           </w:tcPr>
           <w:p>
             <w:r>
@@ -104,7 +106,7 @@
         </w:tc>
         <w:tc>
           <w:tcPr>
-            <w:tcW w:type="dxa" w:w="960"/>
+            <w:tcW w:type="dxa" w:w="785"/>
           </w:tcPr>
           <w:p>
             <w:r>
@@ -112,13 +114,13 @@
                 <w:b/>
                 <w:sz w:val="17"/>
               </w:rPr>
-              <w:t>Calibration reported</w:t>
+              <w:t>Patient independence</w:t>
             </w:r>
           </w:p>
         </w:tc>
         <w:tc>
           <w:tcPr>
-            <w:tcW w:type="dxa" w:w="960"/>
+            <w:tcW w:type="dxa" w:w="785"/>
           </w:tcPr>
           <w:p>
             <w:r>
@@ -126,13 +128,13 @@
                 <w:b/>
                 <w:sz w:val="17"/>
               </w:rPr>
-              <w:t>Decision-curve reported</w:t>
+              <w:t>Clinical comparison</w:t>
             </w:r>
           </w:p>
         </w:tc>
         <w:tc>
           <w:tcPr>
-            <w:tcW w:type="dxa" w:w="960"/>
+            <w:tcW w:type="dxa" w:w="785"/>
           </w:tcPr>
           <w:p>
             <w:r>
@@ -140,13 +142,41 @@
                 <w:b/>
                 <w:sz w:val="17"/>
               </w:rPr>
-              <w:t>Clinical comparator</w:t>
+              <w:t>Reported calibration</w:t>
             </w:r>
           </w:p>
         </w:tc>
         <w:tc>
           <w:tcPr>
-            <w:tcW w:type="dxa" w:w="960"/>
+            <w:tcW w:type="dxa" w:w="785"/>
+          </w:tcPr>
+          <w:p>
+            <w:r>
+              <w:rPr>
+                <w:b/>
+                <w:sz w:val="17"/>
+              </w:rPr>
+              <w:t>Reported decision curve</w:t>
+            </w:r>
+          </w:p>
+        </w:tc>
+        <w:tc>
+          <w:tcPr>
+            <w:tcW w:type="dxa" w:w="785"/>
+          </w:tcPr>
+          <w:p>
+            <w:r>
+              <w:rPr>
+                <w:b/>
+                <w:sz w:val="17"/>
+              </w:rPr>
+              <w:t>Where documented in source</w:t>
+            </w:r>
+          </w:p>
+        </w:tc>
+        <w:tc>
+          <w:tcPr>
+            <w:tcW w:type="dxa" w:w="785"/>
           </w:tcPr>
           <w:p>
             <w:r>
@@ -162,7 +192,7 @@
       <w:tr>
         <w:tc>
           <w:tcPr>
-            <w:tcW w:type="dxa" w:w="960"/>
+            <w:tcW w:type="dxa" w:w="785"/>
           </w:tcPr>
           <w:p>
             <w:pPr>
@@ -178,7 +208,7 @@
         </w:tc>
         <w:tc>
           <w:tcPr>
-            <w:tcW w:type="dxa" w:w="960"/>
+            <w:tcW w:type="dxa" w:w="785"/>
           </w:tcPr>
           <w:p>
             <w:pPr>
@@ -194,7 +224,7 @@
         </w:tc>
         <w:tc>
           <w:tcPr>
-            <w:tcW w:type="dxa" w:w="960"/>
+            <w:tcW w:type="dxa" w:w="785"/>
           </w:tcPr>
           <w:p>
             <w:pPr>
@@ -210,7 +240,7 @@
         </w:tc>
         <w:tc>
           <w:tcPr>
-            <w:tcW w:type="dxa" w:w="960"/>
+            <w:tcW w:type="dxa" w:w="785"/>
           </w:tcPr>
           <w:p>
             <w:pPr>
@@ -226,7 +256,7 @@
         </w:tc>
         <w:tc>
           <w:tcPr>
-            <w:tcW w:type="dxa" w:w="960"/>
+            <w:tcW w:type="dxa" w:w="785"/>
           </w:tcPr>
           <w:p>
             <w:pPr>
@@ -242,7 +272,39 @@
         </w:tc>
         <w:tc>
           <w:tcPr>
-            <w:tcW w:type="dxa" w:w="960"/>
+            <w:tcW w:type="dxa" w:w="785"/>
+          </w:tcPr>
+          <w:p>
+            <w:pPr>
+              <w:spacing w:after="40"/>
+            </w:pPr>
+            <w:r>
+              <w:rPr>
+                <w:sz w:val="17"/>
+              </w:rPr>
+              <w:t>Independent external cohorts</w:t>
+            </w:r>
+          </w:p>
+        </w:tc>
+        <w:tc>
+          <w:tcPr>
+            <w:tcW w:type="dxa" w:w="785"/>
+          </w:tcPr>
+          <w:p>
+            <w:pPr>
+              <w:spacing w:after="40"/>
+            </w:pPr>
+            <w:r>
+              <w:rPr>
+                <w:sz w:val="17"/>
+              </w:rPr>
+              <w:t>TNM stage / clinical variables</w:t>
+            </w:r>
+          </w:p>
+        </w:tc>
+        <w:tc>
+          <w:tcPr>
+            <w:tcW w:type="dxa" w:w="785"/>
           </w:tcPr>
           <w:p>
             <w:pPr>
@@ -258,7 +320,7 @@
         </w:tc>
         <w:tc>
           <w:tcPr>
-            <w:tcW w:type="dxa" w:w="960"/>
+            <w:tcW w:type="dxa" w:w="785"/>
           </w:tcPr>
           <w:p>
             <w:pPr>
@@ -274,7 +336,7 @@
         </w:tc>
         <w:tc>
           <w:tcPr>
-            <w:tcW w:type="dxa" w:w="960"/>
+            <w:tcW w:type="dxa" w:w="785"/>
           </w:tcPr>
           <w:p>
             <w:pPr>
@@ -284,13 +346,13 @@
               <w:rPr>
                 <w:sz w:val="17"/>
               </w:rPr>
-              <w:t>TNM stage / clinical variables</w:t>
+              <w:t>Methods (data and cohort description); Results and figures for the training and validation cohorts</w:t>
             </w:r>
           </w:p>
         </w:tc>
         <w:tc>
           <w:tcPr>
-            <w:tcW w:type="dxa" w:w="960"/>
+            <w:tcW w:type="dxa" w:w="785"/>
           </w:tcPr>
           <w:p>
             <w:pPr>
@@ -308,7 +370,7 @@
       <w:tr>
         <w:tc>
           <w:tcPr>
-            <w:tcW w:type="dxa" w:w="960"/>
+            <w:tcW w:type="dxa" w:w="785"/>
           </w:tcPr>
           <w:p>
             <w:pPr>
@@ -324,7 +386,7 @@
         </w:tc>
         <w:tc>
           <w:tcPr>
-            <w:tcW w:type="dxa" w:w="960"/>
+            <w:tcW w:type="dxa" w:w="785"/>
           </w:tcPr>
           <w:p>
             <w:pPr>
@@ -340,7 +402,7 @@
         </w:tc>
         <w:tc>
           <w:tcPr>
-            <w:tcW w:type="dxa" w:w="960"/>
+            <w:tcW w:type="dxa" w:w="785"/>
           </w:tcPr>
           <w:p>
             <w:pPr>
@@ -356,7 +418,7 @@
         </w:tc>
         <w:tc>
           <w:tcPr>
-            <w:tcW w:type="dxa" w:w="960"/>
+            <w:tcW w:type="dxa" w:w="785"/>
           </w:tcPr>
           <w:p>
             <w:pPr>
@@ -372,7 +434,7 @@
         </w:tc>
         <w:tc>
           <w:tcPr>
-            <w:tcW w:type="dxa" w:w="960"/>
+            <w:tcW w:type="dxa" w:w="785"/>
           </w:tcPr>
           <w:p>
             <w:pPr>
@@ -388,7 +450,39 @@
         </w:tc>
         <w:tc>
           <w:tcPr>
-            <w:tcW w:type="dxa" w:w="960"/>
+            <w:tcW w:type="dxa" w:w="785"/>
+          </w:tcPr>
+          <w:p>
+            <w:pPr>
+              <w:spacing w:after="40"/>
+            </w:pPr>
+            <w:r>
+              <w:rPr>
+                <w:sz w:val="17"/>
+              </w:rPr>
+              <w:t>Multiple independent public datasets; no locked model applied to a held-out cohort</w:t>
+            </w:r>
+          </w:p>
+        </w:tc>
+        <w:tc>
+          <w:tcPr>
+            <w:tcW w:type="dxa" w:w="785"/>
+          </w:tcPr>
+          <w:p>
+            <w:pPr>
+              <w:spacing w:after="40"/>
+            </w:pPr>
+            <w:r>
+              <w:rPr>
+                <w:sz w:val="17"/>
+              </w:rPr>
+              <w:t>Clinicopathological variables</w:t>
+            </w:r>
+          </w:p>
+        </w:tc>
+        <w:tc>
+          <w:tcPr>
+            <w:tcW w:type="dxa" w:w="785"/>
           </w:tcPr>
           <w:p>
             <w:pPr>
@@ -404,7 +498,7 @@
         </w:tc>
         <w:tc>
           <w:tcPr>
-            <w:tcW w:type="dxa" w:w="960"/>
+            <w:tcW w:type="dxa" w:w="785"/>
           </w:tcPr>
           <w:p>
             <w:pPr>
@@ -420,7 +514,7 @@
         </w:tc>
         <w:tc>
           <w:tcPr>
-            <w:tcW w:type="dxa" w:w="960"/>
+            <w:tcW w:type="dxa" w:w="785"/>
           </w:tcPr>
           <w:p>
             <w:pPr>
@@ -430,13 +524,13 @@
               <w:rPr>
                 <w:sz w:val="17"/>
               </w:rPr>
-              <w:t>Clinicopathological variables</w:t>
+              <w:t>Methods (dataset description); Results (expression and survival analyses)</w:t>
             </w:r>
           </w:p>
         </w:tc>
         <w:tc>
           <w:tcPr>
-            <w:tcW w:type="dxa" w:w="960"/>
+            <w:tcW w:type="dxa" w:w="785"/>
           </w:tcPr>
           <w:p>
             <w:pPr>
@@ -454,7 +548,7 @@
       <w:tr>
         <w:tc>
           <w:tcPr>
-            <w:tcW w:type="dxa" w:w="960"/>
+            <w:tcW w:type="dxa" w:w="785"/>
           </w:tcPr>
           <w:p>
             <w:pPr>
@@ -470,7 +564,7 @@
         </w:tc>
         <w:tc>
           <w:tcPr>
-            <w:tcW w:type="dxa" w:w="960"/>
+            <w:tcW w:type="dxa" w:w="785"/>
           </w:tcPr>
           <w:p>
             <w:pPr>
@@ -486,7 +580,7 @@
         </w:tc>
         <w:tc>
           <w:tcPr>
-            <w:tcW w:type="dxa" w:w="960"/>
+            <w:tcW w:type="dxa" w:w="785"/>
           </w:tcPr>
           <w:p>
             <w:pPr>
@@ -502,7 +596,7 @@
         </w:tc>
         <w:tc>
           <w:tcPr>
-            <w:tcW w:type="dxa" w:w="960"/>
+            <w:tcW w:type="dxa" w:w="785"/>
           </w:tcPr>
           <w:p>
             <w:pPr>
@@ -512,13 +606,13 @@
               <w:rPr>
                 <w:sz w:val="17"/>
               </w:rPr>
-              <w:t>External: GSE84433, GSE84437, GSE84426; Mendelian randomization</w:t>
+              <w:t>External: GSE84433, GSE84437, GSE84426; Mendelian randomization component</w:t>
             </w:r>
           </w:p>
         </w:tc>
         <w:tc>
           <w:tcPr>
-            <w:tcW w:type="dxa" w:w="960"/>
+            <w:tcW w:type="dxa" w:w="785"/>
           </w:tcPr>
           <w:p>
             <w:pPr>
@@ -534,7 +628,39 @@
         </w:tc>
         <w:tc>
           <w:tcPr>
-            <w:tcW w:type="dxa" w:w="960"/>
+            <w:tcW w:type="dxa" w:w="785"/>
+          </w:tcPr>
+          <w:p>
+            <w:pPr>
+              <w:spacing w:after="40"/>
+            </w:pPr>
+            <w:r>
+              <w:rPr>
+                <w:sz w:val="17"/>
+              </w:rPr>
+              <w:t>Independent external cohorts</w:t>
+            </w:r>
+          </w:p>
+        </w:tc>
+        <w:tc>
+          <w:tcPr>
+            <w:tcW w:type="dxa" w:w="785"/>
+          </w:tcPr>
+          <w:p>
+            <w:pPr>
+              <w:spacing w:after="40"/>
+            </w:pPr>
+            <w:r>
+              <w:rPr>
+                <w:sz w:val="17"/>
+              </w:rPr>
+              <w:t>Not compared</w:t>
+            </w:r>
+          </w:p>
+        </w:tc>
+        <w:tc>
+          <w:tcPr>
+            <w:tcW w:type="dxa" w:w="785"/>
           </w:tcPr>
           <w:p>
             <w:pPr>
@@ -550,7 +676,7 @@
         </w:tc>
         <w:tc>
           <w:tcPr>
-            <w:tcW w:type="dxa" w:w="960"/>
+            <w:tcW w:type="dxa" w:w="785"/>
           </w:tcPr>
           <w:p>
             <w:pPr>
@@ -566,7 +692,7 @@
         </w:tc>
         <w:tc>
           <w:tcPr>
-            <w:tcW w:type="dxa" w:w="960"/>
+            <w:tcW w:type="dxa" w:w="785"/>
           </w:tcPr>
           <w:p>
             <w:pPr>
@@ -576,13 +702,13 @@
               <w:rPr>
                 <w:sz w:val="17"/>
               </w:rPr>
-              <w:t>Not compared</w:t>
+              <w:t>Methods (data sources); Results (validation and nomogram)</w:t>
             </w:r>
           </w:p>
         </w:tc>
         <w:tc>
           <w:tcPr>
-            <w:tcW w:type="dxa" w:w="960"/>
+            <w:tcW w:type="dxa" w:w="785"/>
           </w:tcPr>
           <w:p>
             <w:pPr>
@@ -600,7 +726,7 @@
       <w:tr>
         <w:tc>
           <w:tcPr>
-            <w:tcW w:type="dxa" w:w="960"/>
+            <w:tcW w:type="dxa" w:w="785"/>
           </w:tcPr>
           <w:p>
             <w:pPr>
@@ -616,7 +742,7 @@
         </w:tc>
         <w:tc>
           <w:tcPr>
-            <w:tcW w:type="dxa" w:w="960"/>
+            <w:tcW w:type="dxa" w:w="785"/>
           </w:tcPr>
           <w:p>
             <w:pPr>
@@ -626,13 +752,13 @@
               <w:rPr>
                 <w:sz w:val="17"/>
               </w:rPr>
-              <w:t>Pyroptosis / scRNA-informed</w:t>
+              <w:t>Pyroptosis / single-cell-informed</w:t>
             </w:r>
           </w:p>
         </w:tc>
         <w:tc>
           <w:tcPr>
-            <w:tcW w:type="dxa" w:w="960"/>
+            <w:tcW w:type="dxa" w:w="785"/>
           </w:tcPr>
           <w:p>
             <w:pPr>
@@ -648,7 +774,7 @@
         </w:tc>
         <w:tc>
           <w:tcPr>
-            <w:tcW w:type="dxa" w:w="960"/>
+            <w:tcW w:type="dxa" w:w="785"/>
           </w:tcPr>
           <w:p>
             <w:pPr>
@@ -658,13 +784,13 @@
               <w:rPr>
                 <w:sz w:val="17"/>
               </w:rPr>
-              <w:t>External: GSE62254 (ACRG cohort, n=300)</w:t>
+              <w:t>External: GSE62254 (Asian Cancer Research Group cohort, n = 300)</w:t>
             </w:r>
           </w:p>
         </w:tc>
         <w:tc>
           <w:tcPr>
-            <w:tcW w:type="dxa" w:w="960"/>
+            <w:tcW w:type="dxa" w:w="785"/>
           </w:tcPr>
           <w:p>
             <w:pPr>
@@ -680,7 +806,39 @@
         </w:tc>
         <w:tc>
           <w:tcPr>
-            <w:tcW w:type="dxa" w:w="960"/>
+            <w:tcW w:type="dxa" w:w="785"/>
+          </w:tcPr>
+          <w:p>
+            <w:pPr>
+              <w:spacing w:after="40"/>
+            </w:pPr>
+            <w:r>
+              <w:rPr>
+                <w:sz w:val="17"/>
+              </w:rPr>
+              <w:t>Independent external cohort; scRNA-seq data used for contextualisation rather than validation</w:t>
+            </w:r>
+          </w:p>
+        </w:tc>
+        <w:tc>
+          <w:tcPr>
+            <w:tcW w:type="dxa" w:w="785"/>
+          </w:tcPr>
+          <w:p>
+            <w:pPr>
+              <w:spacing w:after="40"/>
+            </w:pPr>
+            <w:r>
+              <w:rPr>
+                <w:sz w:val="17"/>
+              </w:rPr>
+              <w:t>TNM stage / clinical variables</w:t>
+            </w:r>
+          </w:p>
+        </w:tc>
+        <w:tc>
+          <w:tcPr>
+            <w:tcW w:type="dxa" w:w="785"/>
           </w:tcPr>
           <w:p>
             <w:pPr>
@@ -696,7 +854,7 @@
         </w:tc>
         <w:tc>
           <w:tcPr>
-            <w:tcW w:type="dxa" w:w="960"/>
+            <w:tcW w:type="dxa" w:w="785"/>
           </w:tcPr>
           <w:p>
             <w:pPr>
@@ -712,7 +870,7 @@
         </w:tc>
         <w:tc>
           <w:tcPr>
-            <w:tcW w:type="dxa" w:w="960"/>
+            <w:tcW w:type="dxa" w:w="785"/>
           </w:tcPr>
           <w:p>
             <w:pPr>
@@ -722,13 +880,13 @@
               <w:rPr>
                 <w:sz w:val="17"/>
               </w:rPr>
-              <w:t>TNM stage / clinical variables</w:t>
+              <w:t>Methods (scRNA-seq and bulk data); Results (GSE62254 validation)</w:t>
             </w:r>
           </w:p>
         </w:tc>
         <w:tc>
           <w:tcPr>
-            <w:tcW w:type="dxa" w:w="960"/>
+            <w:tcW w:type="dxa" w:w="785"/>
           </w:tcPr>
           <w:p>
             <w:pPr>
@@ -746,7 +904,7 @@
       <w:tr>
         <w:tc>
           <w:tcPr>
-            <w:tcW w:type="dxa" w:w="960"/>
+            <w:tcW w:type="dxa" w:w="785"/>
           </w:tcPr>
           <w:p>
             <w:pPr>
@@ -762,7 +920,7 @@
         </w:tc>
         <w:tc>
           <w:tcPr>
-            <w:tcW w:type="dxa" w:w="960"/>
+            <w:tcW w:type="dxa" w:w="785"/>
           </w:tcPr>
           <w:p>
             <w:pPr>
@@ -778,7 +936,7 @@
         </w:tc>
         <w:tc>
           <w:tcPr>
-            <w:tcW w:type="dxa" w:w="960"/>
+            <w:tcW w:type="dxa" w:w="785"/>
           </w:tcPr>
           <w:p>
             <w:pPr>
@@ -788,13 +946,13 @@
               <w:rPr>
                 <w:sz w:val="17"/>
               </w:rPr>
-              <w:t>SYSUCC discovery cohort (12 patients, paired peritoneal/primary/normal tissue)</w:t>
+              <w:t>SYSUCC discovery cohort (12 patients; paired peritoneal, primary tumour, and normal tissue)</w:t>
             </w:r>
           </w:p>
         </w:tc>
         <w:tc>
           <w:tcPr>
-            <w:tcW w:type="dxa" w:w="960"/>
+            <w:tcW w:type="dxa" w:w="785"/>
           </w:tcPr>
           <w:p>
             <w:pPr>
@@ -804,13 +962,13 @@
               <w:rPr>
                 <w:sz w:val="17"/>
               </w:rPr>
-              <w:t>SYSUCC validation cohort (231 stage II-III patients) plus interactive TCGA analysis</w:t>
+              <w:t>SYSUCC validation cohort (231 stage II-III patients) plus interactive analysis against TCGA</w:t>
             </w:r>
           </w:p>
         </w:tc>
         <w:tc>
           <w:tcPr>
-            <w:tcW w:type="dxa" w:w="960"/>
+            <w:tcW w:type="dxa" w:w="785"/>
           </w:tcPr>
           <w:p>
             <w:pPr>
@@ -826,7 +984,39 @@
         </w:tc>
         <w:tc>
           <w:tcPr>
-            <w:tcW w:type="dxa" w:w="960"/>
+            <w:tcW w:type="dxa" w:w="785"/>
+          </w:tcPr>
+          <w:p>
+            <w:pPr>
+              <w:spacing w:after="40"/>
+            </w:pPr>
+            <w:r>
+              <w:rPr>
+                <w:sz w:val="17"/>
+              </w:rPr>
+              <w:t>Validation uses a separate patient set at the same institution; not an external multicentre cohort</w:t>
+            </w:r>
+          </w:p>
+        </w:tc>
+        <w:tc>
+          <w:tcPr>
+            <w:tcW w:type="dxa" w:w="785"/>
+          </w:tcPr>
+          <w:p>
+            <w:pPr>
+              <w:spacing w:after="40"/>
+            </w:pPr>
+            <w:r>
+              <w:rPr>
+                <w:sz w:val="17"/>
+              </w:rPr>
+              <w:t>Clinical variables</w:t>
+            </w:r>
+          </w:p>
+        </w:tc>
+        <w:tc>
+          <w:tcPr>
+            <w:tcW w:type="dxa" w:w="785"/>
           </w:tcPr>
           <w:p>
             <w:pPr>
@@ -842,7 +1032,7 @@
         </w:tc>
         <w:tc>
           <w:tcPr>
-            <w:tcW w:type="dxa" w:w="960"/>
+            <w:tcW w:type="dxa" w:w="785"/>
           </w:tcPr>
           <w:p>
             <w:pPr>
@@ -858,7 +1048,7 @@
         </w:tc>
         <w:tc>
           <w:tcPr>
-            <w:tcW w:type="dxa" w:w="960"/>
+            <w:tcW w:type="dxa" w:w="785"/>
           </w:tcPr>
           <w:p>
             <w:pPr>
@@ -868,13 +1058,13 @@
               <w:rPr>
                 <w:sz w:val="17"/>
               </w:rPr>
-              <w:t>Clinical variables</w:t>
+              <w:t>Methods (SYSUCC discovery and validation cohorts); Results (key lncRNA identification)</w:t>
             </w:r>
           </w:p>
         </w:tc>
         <w:tc>
           <w:tcPr>
-            <w:tcW w:type="dxa" w:w="960"/>
+            <w:tcW w:type="dxa" w:w="785"/>
           </w:tcPr>
           <w:p>
             <w:pPr>
@@ -892,7 +1082,7 @@
       <w:tr>
         <w:tc>
           <w:tcPr>
-            <w:tcW w:type="dxa" w:w="960"/>
+            <w:tcW w:type="dxa" w:w="785"/>
           </w:tcPr>
           <w:p>
             <w:pPr>
@@ -908,7 +1098,7 @@
         </w:tc>
         <w:tc>
           <w:tcPr>
-            <w:tcW w:type="dxa" w:w="960"/>
+            <w:tcW w:type="dxa" w:w="785"/>
           </w:tcPr>
           <w:p>
             <w:pPr>
@@ -924,7 +1114,7 @@
         </w:tc>
         <w:tc>
           <w:tcPr>
-            <w:tcW w:type="dxa" w:w="960"/>
+            <w:tcW w:type="dxa" w:w="785"/>
           </w:tcPr>
           <w:p>
             <w:pPr>
@@ -940,7 +1130,7 @@
         </w:tc>
         <w:tc>
           <w:tcPr>
-            <w:tcW w:type="dxa" w:w="960"/>
+            <w:tcW w:type="dxa" w:w="785"/>
           </w:tcPr>
           <w:p>
             <w:pPr>
@@ -950,13 +1140,13 @@
               <w:rPr>
                 <w:sz w:val="17"/>
               </w:rPr>
-              <w:t>Internal only: random training/testing split of the TCGA cohort</w:t>
+              <w:t>Internal only: random training/testing split of the same TCGA cohort</w:t>
             </w:r>
           </w:p>
         </w:tc>
         <w:tc>
           <w:tcPr>
-            <w:tcW w:type="dxa" w:w="960"/>
+            <w:tcW w:type="dxa" w:w="785"/>
           </w:tcPr>
           <w:p>
             <w:pPr>
@@ -972,7 +1162,39 @@
         </w:tc>
         <w:tc>
           <w:tcPr>
-            <w:tcW w:type="dxa" w:w="960"/>
+            <w:tcW w:type="dxa" w:w="785"/>
+          </w:tcPr>
+          <w:p>
+            <w:pPr>
+              <w:spacing w:after="40"/>
+            </w:pPr>
+            <w:r>
+              <w:rPr>
+                <w:sz w:val="17"/>
+              </w:rPr>
+              <w:t>NOT independent: testing set drawn from the same cohort as the training set</w:t>
+            </w:r>
+          </w:p>
+        </w:tc>
+        <w:tc>
+          <w:tcPr>
+            <w:tcW w:type="dxa" w:w="785"/>
+          </w:tcPr>
+          <w:p>
+            <w:pPr>
+              <w:spacing w:after="40"/>
+            </w:pPr>
+            <w:r>
+              <w:rPr>
+                <w:sz w:val="17"/>
+              </w:rPr>
+              <w:t>TNM stage / clinical variables</w:t>
+            </w:r>
+          </w:p>
+        </w:tc>
+        <w:tc>
+          <w:tcPr>
+            <w:tcW w:type="dxa" w:w="785"/>
           </w:tcPr>
           <w:p>
             <w:pPr>
@@ -988,7 +1210,7 @@
         </w:tc>
         <w:tc>
           <w:tcPr>
-            <w:tcW w:type="dxa" w:w="960"/>
+            <w:tcW w:type="dxa" w:w="785"/>
           </w:tcPr>
           <w:p>
             <w:pPr>
@@ -1004,7 +1226,7 @@
         </w:tc>
         <w:tc>
           <w:tcPr>
-            <w:tcW w:type="dxa" w:w="960"/>
+            <w:tcW w:type="dxa" w:w="785"/>
           </w:tcPr>
           <w:p>
             <w:pPr>
@@ -1014,13 +1236,13 @@
               <w:rPr>
                 <w:sz w:val="17"/>
               </w:rPr>
-              <w:t>TNM stage / clinical variables</w:t>
+              <w:t>Methods (random assignment to training and testing sets); Results</w:t>
             </w:r>
           </w:p>
         </w:tc>
         <w:tc>
           <w:tcPr>
-            <w:tcW w:type="dxa" w:w="960"/>
+            <w:tcW w:type="dxa" w:w="785"/>
           </w:tcPr>
           <w:p>
             <w:pPr>
@@ -1038,7 +1260,7 @@
       <w:tr>
         <w:tc>
           <w:tcPr>
-            <w:tcW w:type="dxa" w:w="960"/>
+            <w:tcW w:type="dxa" w:w="785"/>
           </w:tcPr>
           <w:p>
             <w:pPr>
@@ -1054,7 +1276,7 @@
         </w:tc>
         <w:tc>
           <w:tcPr>
-            <w:tcW w:type="dxa" w:w="960"/>
+            <w:tcW w:type="dxa" w:w="785"/>
           </w:tcPr>
           <w:p>
             <w:pPr>
@@ -1064,13 +1286,13 @@
               <w:rPr>
                 <w:sz w:val="17"/>
               </w:rPr>
-              <w:t>Antigen-presenting fibroblasts / scRNA</w:t>
+              <w:t>Antigen-presenting fibroblasts / single-cell</w:t>
             </w:r>
           </w:p>
         </w:tc>
         <w:tc>
           <w:tcPr>
-            <w:tcW w:type="dxa" w:w="960"/>
+            <w:tcW w:type="dxa" w:w="785"/>
           </w:tcPr>
           <w:p>
             <w:pPr>
@@ -1086,7 +1308,7 @@
         </w:tc>
         <w:tc>
           <w:tcPr>
-            <w:tcW w:type="dxa" w:w="960"/>
+            <w:tcW w:type="dxa" w:w="785"/>
           </w:tcPr>
           <w:p>
             <w:pPr>
@@ -1102,7 +1324,7 @@
         </w:tc>
         <w:tc>
           <w:tcPr>
-            <w:tcW w:type="dxa" w:w="960"/>
+            <w:tcW w:type="dxa" w:w="785"/>
           </w:tcPr>
           <w:p>
             <w:pPr>
@@ -1118,7 +1340,39 @@
         </w:tc>
         <w:tc>
           <w:tcPr>
-            <w:tcW w:type="dxa" w:w="960"/>
+            <w:tcW w:type="dxa" w:w="785"/>
+          </w:tcPr>
+          <w:p>
+            <w:pPr>
+              <w:spacing w:after="40"/>
+            </w:pPr>
+            <w:r>
+              <w:rPr>
+                <w:sz w:val="17"/>
+              </w:rPr>
+              <w:t>Independent external cohorts</w:t>
+            </w:r>
+          </w:p>
+        </w:tc>
+        <w:tc>
+          <w:tcPr>
+            <w:tcW w:type="dxa" w:w="785"/>
+          </w:tcPr>
+          <w:p>
+            <w:pPr>
+              <w:spacing w:after="40"/>
+            </w:pPr>
+            <w:r>
+              <w:rPr>
+                <w:sz w:val="17"/>
+              </w:rPr>
+              <w:t>TNM stage / clinical variables</w:t>
+            </w:r>
+          </w:p>
+        </w:tc>
+        <w:tc>
+          <w:tcPr>
+            <w:tcW w:type="dxa" w:w="785"/>
           </w:tcPr>
           <w:p>
             <w:pPr>
@@ -1134,7 +1388,7 @@
         </w:tc>
         <w:tc>
           <w:tcPr>
-            <w:tcW w:type="dxa" w:w="960"/>
+            <w:tcW w:type="dxa" w:w="785"/>
           </w:tcPr>
           <w:p>
             <w:pPr>
@@ -1150,7 +1404,7 @@
         </w:tc>
         <w:tc>
           <w:tcPr>
-            <w:tcW w:type="dxa" w:w="960"/>
+            <w:tcW w:type="dxa" w:w="785"/>
           </w:tcPr>
           <w:p>
             <w:pPr>
@@ -1160,13 +1414,13 @@
               <w:rPr>
                 <w:sz w:val="17"/>
               </w:rPr>
-              <w:t>TNM stage / clinical variables</w:t>
+              <w:t>Methods (validation datasets); Results (validation KM and ROC)</w:t>
             </w:r>
           </w:p>
         </w:tc>
         <w:tc>
           <w:tcPr>
-            <w:tcW w:type="dxa" w:w="960"/>
+            <w:tcW w:type="dxa" w:w="785"/>
           </w:tcPr>
           <w:p>
             <w:pPr>
@@ -1184,7 +1438,7 @@
       <w:tr>
         <w:tc>
           <w:tcPr>
-            <w:tcW w:type="dxa" w:w="960"/>
+            <w:tcW w:type="dxa" w:w="785"/>
           </w:tcPr>
           <w:p>
             <w:pPr>
@@ -1200,7 +1454,7 @@
         </w:tc>
         <w:tc>
           <w:tcPr>
-            <w:tcW w:type="dxa" w:w="960"/>
+            <w:tcW w:type="dxa" w:w="785"/>
           </w:tcPr>
           <w:p>
             <w:pPr>
@@ -1216,7 +1470,7 @@
         </w:tc>
         <w:tc>
           <w:tcPr>
-            <w:tcW w:type="dxa" w:w="960"/>
+            <w:tcW w:type="dxa" w:w="785"/>
           </w:tcPr>
           <w:p>
             <w:pPr>
@@ -1232,7 +1486,7 @@
         </w:tc>
         <w:tc>
           <w:tcPr>
-            <w:tcW w:type="dxa" w:w="960"/>
+            <w:tcW w:type="dxa" w:w="785"/>
           </w:tcPr>
           <w:p>
             <w:pPr>
@@ -1242,13 +1496,13 @@
               <w:rPr>
                 <w:sz w:val="17"/>
               </w:rPr>
-              <w:t>External: GSE15460 (n=248)</w:t>
+              <w:t>External: GSE15460 (n = 248)</w:t>
             </w:r>
           </w:p>
         </w:tc>
         <w:tc>
           <w:tcPr>
-            <w:tcW w:type="dxa" w:w="960"/>
+            <w:tcW w:type="dxa" w:w="785"/>
           </w:tcPr>
           <w:p>
             <w:pPr>
@@ -1264,7 +1518,39 @@
         </w:tc>
         <w:tc>
           <w:tcPr>
-            <w:tcW w:type="dxa" w:w="960"/>
+            <w:tcW w:type="dxa" w:w="785"/>
+          </w:tcPr>
+          <w:p>
+            <w:pPr>
+              <w:spacing w:after="40"/>
+            </w:pPr>
+            <w:r>
+              <w:rPr>
+                <w:sz w:val="17"/>
+              </w:rPr>
+              <w:t>Independent external cohort</w:t>
+            </w:r>
+          </w:p>
+        </w:tc>
+        <w:tc>
+          <w:tcPr>
+            <w:tcW w:type="dxa" w:w="785"/>
+          </w:tcPr>
+          <w:p>
+            <w:pPr>
+              <w:spacing w:after="40"/>
+            </w:pPr>
+            <w:r>
+              <w:rPr>
+                <w:sz w:val="17"/>
+              </w:rPr>
+              <w:t>Clinicopathological variables</w:t>
+            </w:r>
+          </w:p>
+        </w:tc>
+        <w:tc>
+          <w:tcPr>
+            <w:tcW w:type="dxa" w:w="785"/>
           </w:tcPr>
           <w:p>
             <w:pPr>
@@ -1280,7 +1566,7 @@
         </w:tc>
         <w:tc>
           <w:tcPr>
-            <w:tcW w:type="dxa" w:w="960"/>
+            <w:tcW w:type="dxa" w:w="785"/>
           </w:tcPr>
           <w:p>
             <w:pPr>
@@ -1296,7 +1582,7 @@
         </w:tc>
         <w:tc>
           <w:tcPr>
-            <w:tcW w:type="dxa" w:w="960"/>
+            <w:tcW w:type="dxa" w:w="785"/>
           </w:tcPr>
           <w:p>
             <w:pPr>
@@ -1306,13 +1592,13 @@
               <w:rPr>
                 <w:sz w:val="17"/>
               </w:rPr>
-              <w:t>Clinicopathological variables</w:t>
+              <w:t>Methods (validation set); Results (model validation)</w:t>
             </w:r>
           </w:p>
         </w:tc>
         <w:tc>
           <w:tcPr>
-            <w:tcW w:type="dxa" w:w="960"/>
+            <w:tcW w:type="dxa" w:w="785"/>
           </w:tcPr>
           <w:p>
             <w:pPr>
@@ -1330,7 +1616,7 @@
       <w:tr>
         <w:tc>
           <w:tcPr>
-            <w:tcW w:type="dxa" w:w="960"/>
+            <w:tcW w:type="dxa" w:w="785"/>
           </w:tcPr>
           <w:p>
             <w:pPr>
@@ -1346,7 +1632,7 @@
         </w:tc>
         <w:tc>
           <w:tcPr>
-            <w:tcW w:type="dxa" w:w="960"/>
+            <w:tcW w:type="dxa" w:w="785"/>
           </w:tcPr>
           <w:p>
             <w:pPr>
@@ -1362,7 +1648,7 @@
         </w:tc>
         <w:tc>
           <w:tcPr>
-            <w:tcW w:type="dxa" w:w="960"/>
+            <w:tcW w:type="dxa" w:w="785"/>
           </w:tcPr>
           <w:p>
             <w:pPr>
@@ -1378,7 +1664,7 @@
         </w:tc>
         <w:tc>
           <w:tcPr>
-            <w:tcW w:type="dxa" w:w="960"/>
+            <w:tcW w:type="dxa" w:w="785"/>
           </w:tcPr>
           <w:p>
             <w:pPr>
@@ -1394,7 +1680,7 @@
         </w:tc>
         <w:tc>
           <w:tcPr>
-            <w:tcW w:type="dxa" w:w="960"/>
+            <w:tcW w:type="dxa" w:w="785"/>
           </w:tcPr>
           <w:p>
             <w:pPr>
@@ -1410,7 +1696,39 @@
         </w:tc>
         <w:tc>
           <w:tcPr>
-            <w:tcW w:type="dxa" w:w="960"/>
+            <w:tcW w:type="dxa" w:w="785"/>
+          </w:tcPr>
+          <w:p>
+            <w:pPr>
+              <w:spacing w:after="40"/>
+            </w:pPr>
+            <w:r>
+              <w:rPr>
+                <w:sz w:val="17"/>
+              </w:rPr>
+              <w:t>Not clearly delineated in the source article</w:t>
+            </w:r>
+          </w:p>
+        </w:tc>
+        <w:tc>
+          <w:tcPr>
+            <w:tcW w:type="dxa" w:w="785"/>
+          </w:tcPr>
+          <w:p>
+            <w:pPr>
+              <w:spacing w:after="40"/>
+            </w:pPr>
+            <w:r>
+              <w:rPr>
+                <w:sz w:val="17"/>
+              </w:rPr>
+              <w:t>TNM stage / clinical variables</w:t>
+            </w:r>
+          </w:p>
+        </w:tc>
+        <w:tc>
+          <w:tcPr>
+            <w:tcW w:type="dxa" w:w="785"/>
           </w:tcPr>
           <w:p>
             <w:pPr>
@@ -1426,7 +1744,7 @@
         </w:tc>
         <w:tc>
           <w:tcPr>
-            <w:tcW w:type="dxa" w:w="960"/>
+            <w:tcW w:type="dxa" w:w="785"/>
           </w:tcPr>
           <w:p>
             <w:pPr>
@@ -1442,7 +1760,7 @@
         </w:tc>
         <w:tc>
           <w:tcPr>
-            <w:tcW w:type="dxa" w:w="960"/>
+            <w:tcW w:type="dxa" w:w="785"/>
           </w:tcPr>
           <w:p>
             <w:pPr>
@@ -1452,13 +1770,13 @@
               <w:rPr>
                 <w:sz w:val="17"/>
               </w:rPr>
-              <w:t>TNM stage / clinical variables</w:t>
+              <w:t>Methods (data sources); Results (training-set risk model)</w:t>
             </w:r>
           </w:p>
         </w:tc>
         <w:tc>
           <w:tcPr>
-            <w:tcW w:type="dxa" w:w="960"/>
+            <w:tcW w:type="dxa" w:w="785"/>
           </w:tcPr>
           <w:p>
             <w:pPr>
@@ -1476,7 +1794,7 @@
       <w:tr>
         <w:tc>
           <w:tcPr>
-            <w:tcW w:type="dxa" w:w="960"/>
+            <w:tcW w:type="dxa" w:w="785"/>
           </w:tcPr>
           <w:p>
             <w:pPr>
@@ -1492,7 +1810,7 @@
         </w:tc>
         <w:tc>
           <w:tcPr>
-            <w:tcW w:type="dxa" w:w="960"/>
+            <w:tcW w:type="dxa" w:w="785"/>
           </w:tcPr>
           <w:p>
             <w:pPr>
@@ -1508,7 +1826,7 @@
         </w:tc>
         <w:tc>
           <w:tcPr>
-            <w:tcW w:type="dxa" w:w="960"/>
+            <w:tcW w:type="dxa" w:w="785"/>
           </w:tcPr>
           <w:p>
             <w:pPr>
@@ -1524,7 +1842,7 @@
         </w:tc>
         <w:tc>
           <w:tcPr>
-            <w:tcW w:type="dxa" w:w="960"/>
+            <w:tcW w:type="dxa" w:w="785"/>
           </w:tcPr>
           <w:p>
             <w:pPr>
@@ -1540,7 +1858,7 @@
         </w:tc>
         <w:tc>
           <w:tcPr>
-            <w:tcW w:type="dxa" w:w="960"/>
+            <w:tcW w:type="dxa" w:w="785"/>
           </w:tcPr>
           <w:p>
             <w:pPr>
@@ -1556,7 +1874,39 @@
         </w:tc>
         <w:tc>
           <w:tcPr>
-            <w:tcW w:type="dxa" w:w="960"/>
+            <w:tcW w:type="dxa" w:w="785"/>
+          </w:tcPr>
+          <w:p>
+            <w:pPr>
+              <w:spacing w:after="40"/>
+            </w:pPr>
+            <w:r>
+              <w:rPr>
+                <w:sz w:val="17"/>
+              </w:rPr>
+              <w:t>Independent external cohorts</w:t>
+            </w:r>
+          </w:p>
+        </w:tc>
+        <w:tc>
+          <w:tcPr>
+            <w:tcW w:type="dxa" w:w="785"/>
+          </w:tcPr>
+          <w:p>
+            <w:pPr>
+              <w:spacing w:after="40"/>
+            </w:pPr>
+            <w:r>
+              <w:rPr>
+                <w:sz w:val="17"/>
+              </w:rPr>
+              <w:t>Univariate and multivariate Cox analysis with clinical variables</w:t>
+            </w:r>
+          </w:p>
+        </w:tc>
+        <w:tc>
+          <w:tcPr>
+            <w:tcW w:type="dxa" w:w="785"/>
           </w:tcPr>
           <w:p>
             <w:pPr>
@@ -1572,7 +1922,7 @@
         </w:tc>
         <w:tc>
           <w:tcPr>
-            <w:tcW w:type="dxa" w:w="960"/>
+            <w:tcW w:type="dxa" w:w="785"/>
           </w:tcPr>
           <w:p>
             <w:pPr>
@@ -1588,7 +1938,7 @@
         </w:tc>
         <w:tc>
           <w:tcPr>
-            <w:tcW w:type="dxa" w:w="960"/>
+            <w:tcW w:type="dxa" w:w="785"/>
           </w:tcPr>
           <w:p>
             <w:pPr>
@@ -1598,13 +1948,13 @@
               <w:rPr>
                 <w:sz w:val="17"/>
               </w:rPr>
-              <w:t>Univariate/multivariate Cox with clinical variables</w:t>
+              <w:t>Methods (GEO datasets); Results (model construction and verification)</w:t>
             </w:r>
           </w:p>
         </w:tc>
         <w:tc>
           <w:tcPr>
-            <w:tcW w:type="dxa" w:w="960"/>
+            <w:tcW w:type="dxa" w:w="785"/>
           </w:tcPr>
           <w:p>
             <w:pPr>
@@ -1622,7 +1972,7 @@
       <w:tr>
         <w:tc>
           <w:tcPr>
-            <w:tcW w:type="dxa" w:w="960"/>
+            <w:tcW w:type="dxa" w:w="785"/>
           </w:tcPr>
           <w:p>
             <w:pPr>
@@ -1638,7 +1988,7 @@
         </w:tc>
         <w:tc>
           <w:tcPr>
-            <w:tcW w:type="dxa" w:w="960"/>
+            <w:tcW w:type="dxa" w:w="785"/>
           </w:tcPr>
           <w:p>
             <w:pPr>
@@ -1654,7 +2004,7 @@
         </w:tc>
         <w:tc>
           <w:tcPr>
-            <w:tcW w:type="dxa" w:w="960"/>
+            <w:tcW w:type="dxa" w:w="785"/>
           </w:tcPr>
           <w:p>
             <w:pPr>
@@ -1670,7 +2020,7 @@
         </w:tc>
         <w:tc>
           <w:tcPr>
-            <w:tcW w:type="dxa" w:w="960"/>
+            <w:tcW w:type="dxa" w:w="785"/>
           </w:tcPr>
           <w:p>
             <w:pPr>
@@ -1680,13 +2030,13 @@
               <w:rPr>
                 <w:sz w:val="17"/>
               </w:rPr>
-              <w:t>Internal held-out validation set for the image-based model; multi-omics integration</w:t>
+              <w:t>Internal held-out validation set for the image-based deep-learning model; multi-omics integration for the prognostic framework</w:t>
             </w:r>
           </w:p>
         </w:tc>
         <w:tc>
           <w:tcPr>
-            <w:tcW w:type="dxa" w:w="960"/>
+            <w:tcW w:type="dxa" w:w="785"/>
           </w:tcPr>
           <w:p>
             <w:pPr>
@@ -1702,7 +2052,23 @@
         </w:tc>
         <w:tc>
           <w:tcPr>
-            <w:tcW w:type="dxa" w:w="960"/>
+            <w:tcW w:type="dxa" w:w="785"/>
+          </w:tcPr>
+          <w:p>
+            <w:pPr>
+              <w:spacing w:after="40"/>
+            </w:pPr>
+            <w:r>
+              <w:rPr>
+                <w:sz w:val="17"/>
+              </w:rPr>
+              <w:t>Internal held-out split for the image model; not an external cohort</w:t>
+            </w:r>
+          </w:p>
+        </w:tc>
+        <w:tc>
+          <w:tcPr>
+            <w:tcW w:type="dxa" w:w="785"/>
           </w:tcPr>
           <w:p>
             <w:pPr>
@@ -1718,7 +2084,7 @@
         </w:tc>
         <w:tc>
           <w:tcPr>
-            <w:tcW w:type="dxa" w:w="960"/>
+            <w:tcW w:type="dxa" w:w="785"/>
           </w:tcPr>
           <w:p>
             <w:pPr>
@@ -1734,7 +2100,7 @@
         </w:tc>
         <w:tc>
           <w:tcPr>
-            <w:tcW w:type="dxa" w:w="960"/>
+            <w:tcW w:type="dxa" w:w="785"/>
           </w:tcPr>
           <w:p>
             <w:pPr>
@@ -1750,7 +2116,23 @@
         </w:tc>
         <w:tc>
           <w:tcPr>
-            <w:tcW w:type="dxa" w:w="960"/>
+            <w:tcW w:type="dxa" w:w="785"/>
+          </w:tcPr>
+          <w:p>
+            <w:pPr>
+              <w:spacing w:after="40"/>
+            </w:pPr>
+            <w:r>
+              <w:rPr>
+                <w:sz w:val="17"/>
+              </w:rPr>
+              <w:t>Methods (dataset collection and train/validation split); Results (model development and validation)</w:t>
+            </w:r>
+          </w:p>
+        </w:tc>
+        <w:tc>
+          <w:tcPr>
+            <w:tcW w:type="dxa" w:w="785"/>
           </w:tcPr>
           <w:p>
             <w:pPr>

</xml_diff>